<commit_message>
Unify portfolio navigation and remove em dashes
</commit_message>
<xml_diff>
--- a/downloads/ai/kyle-hobson-ai-resume.docx
+++ b/downloads/ai/kyle-hobson-ai-resume.docx
@@ -117,7 +117,7 @@
         <w:pStyle w:val="Heading2"/>
       </w:pPr>
       <w:r>
-        <w:t>Arizona State University — Learning Innovations</w:t>
+        <w:t>Arizona State University, Learning Innovations</w:t>
       </w:r>
     </w:p>
     <w:p>
@@ -446,7 +446,7 @@
         <w:rPr>
           <w:b/>
         </w:rPr>
-        <w:t>Arizona State University — Knowledge Enterprise</w:t>
+        <w:t>Arizona State University, Knowledge Enterprise</w:t>
       </w:r>
     </w:p>
     <w:p>

</xml_diff>